<commit_message>
latest: replace practice docx with unlabeled versions
</commit_message>
<xml_diff>
--- a/latest/files/FAQ.docx
+++ b/latest/files/FAQ.docx
@@ -27515,10 +27515,4 @@
     </a:ext>
   </a:extLst>
 </a:theme>
-</file>
-
-<file path=docMetadata/LabelInfo.xml><?xml version="1.0" encoding="utf-8"?>
-<clbl:labelList xmlns:clbl="http://schemas.microsoft.com/office/2020/mipLabelMetadata">
-  <clbl:label id="{f42aa342-8706-4288-bd11-ebb85995028c}" enabled="1" method="Privileged" siteId="{72f988bf-86f1-41af-91ab-2d7cd011db47}" removed="0"/>
-</clbl:labelList>
 </file>
</xml_diff>